<commit_message>
doc: add proposal pdf and .docx
</commit_message>
<xml_diff>
--- a/documents/Proposal Report.docx
+++ b/documents/Proposal Report.docx
@@ -3999,7 +3999,7 @@
           <w:szCs w:val="22"/>
           <w14:ligatures w14:val="standardContextual"/>
         </w:rPr>
-        <w:pict w14:anchorId="5CDE33B7">
+        <w:pict w14:anchorId="348BD823">
           <v:rect id="_x0000_i1025" style="width:0;height:1.5pt" o:hralign="center" o:hrstd="t" o:hr="t" fillcolor="#a0a0a0" stroked="f"/>
         </w:pict>
       </w:r>
@@ -5467,7 +5467,16 @@
           <w:sz w:val="22"/>
           <w:szCs w:val="22"/>
         </w:rPr>
-        <w:t>The system generates a unique Booking ID and updates the corresponding room status to "Unavailable / Reserved."</w:t>
+        <w:t>U</w:t>
+      </w:r>
+      <w:r>
+        <w:rPr>
+          <w:rFonts w:ascii="CMU Serif Roman" w:hAnsi="CMU Serif Roman" w:cs="CMU Serif Roman"/>
+          <w:color w:val="000000"/>
+          <w:sz w:val="22"/>
+          <w:szCs w:val="22"/>
+        </w:rPr>
+        <w:t>pon check-in, the booking status is updated to "Currently Staying." Upon check-out, the room status is updated to "Available."</w:t>
       </w:r>
     </w:p>
     <w:p>
@@ -6557,7 +6566,18 @@
           <w:sz w:val="22"/>
           <w:szCs w:val="22"/>
         </w:rPr>
-        <w:t>Module : Billing &amp; Payment Management</w:t>
+        <w:t xml:space="preserve">Module : </w:t>
+      </w:r>
+      <w:r>
+        <w:rPr>
+          <w:rFonts w:ascii="CMU Serif Roman" w:hAnsi="CMU Serif Roman" w:cs="CMU Serif Roman"/>
+          <w:b/>
+          <w:bCs/>
+          <w:color w:val="000000"/>
+          <w:sz w:val="22"/>
+          <w:szCs w:val="22"/>
+        </w:rPr>
+        <w:t>Pet care &amp; Daily Reporting</w:t>
       </w:r>
     </w:p>
     <w:p>
@@ -7731,7 +7751,7 @@
           <w:sz w:val="22"/>
           <w:szCs w:val="22"/>
         </w:rPr>
-        <w:t xml:space="preserve">Manager / Gneneral Staff </w:t>
+        <w:t xml:space="preserve">Manager / Gneral Staff </w:t>
       </w:r>
     </w:p>
     <w:p>
@@ -8040,7 +8060,29 @@
           <w:sz w:val="22"/>
           <w:szCs w:val="22"/>
         </w:rPr>
-        <w:t>Busniess Overview Dashboard</w:t>
+        <w:t>Busi</w:t>
+      </w:r>
+      <w:r>
+        <w:rPr>
+          <w:rFonts w:ascii="CMU Serif Roman" w:hAnsi="CMU Serif Roman" w:cs="CMU Serif Roman"/>
+          <w:b/>
+          <w:bCs/>
+          <w:color w:val="000000"/>
+          <w:sz w:val="22"/>
+          <w:szCs w:val="22"/>
+        </w:rPr>
+        <w:t>n</w:t>
+      </w:r>
+      <w:r>
+        <w:rPr>
+          <w:rFonts w:ascii="CMU Serif Roman" w:hAnsi="CMU Serif Roman" w:cs="CMU Serif Roman"/>
+          <w:b/>
+          <w:bCs/>
+          <w:color w:val="000000"/>
+          <w:sz w:val="22"/>
+          <w:szCs w:val="22"/>
+        </w:rPr>
+        <w:t>ess Overview Dashboard</w:t>
       </w:r>
     </w:p>
     <w:p>
@@ -8878,7 +8920,25 @@
           <w:sz w:val="22"/>
           <w:szCs w:val="22"/>
         </w:rPr>
-        <w:t xml:space="preserve"> The staff member possesses a valid user acount and password.</w:t>
+        <w:t xml:space="preserve"> The staff member possesses a valid user ac</w:t>
+      </w:r>
+      <w:r>
+        <w:rPr>
+          <w:rFonts w:ascii="CMU Serif Roman" w:hAnsi="CMU Serif Roman" w:cs="CMU Serif Roman"/>
+          <w:color w:val="000000"/>
+          <w:sz w:val="22"/>
+          <w:szCs w:val="22"/>
+        </w:rPr>
+        <w:t>c</w:t>
+      </w:r>
+      <w:r>
+        <w:rPr>
+          <w:rFonts w:ascii="CMU Serif Roman" w:hAnsi="CMU Serif Roman" w:cs="CMU Serif Roman"/>
+          <w:color w:val="000000"/>
+          <w:sz w:val="22"/>
+          <w:szCs w:val="22"/>
+        </w:rPr>
+        <w:t>ount and password.</w:t>
       </w:r>
     </w:p>
     <w:p>
@@ -9846,7 +9906,29 @@
           <w:sz w:val="22"/>
           <w:szCs w:val="22"/>
         </w:rPr>
-        <w:t xml:space="preserve">User Account &amp; Porfile Management </w:t>
+        <w:t>User Account &amp; Pr</w:t>
+      </w:r>
+      <w:r>
+        <w:rPr>
+          <w:rFonts w:ascii="CMU Serif Roman" w:hAnsi="CMU Serif Roman" w:cs="CMU Serif Roman"/>
+          <w:b/>
+          <w:bCs/>
+          <w:color w:val="000000"/>
+          <w:sz w:val="22"/>
+          <w:szCs w:val="22"/>
+        </w:rPr>
+        <w:t>o</w:t>
+      </w:r>
+      <w:r>
+        <w:rPr>
+          <w:rFonts w:ascii="CMU Serif Roman" w:hAnsi="CMU Serif Roman" w:cs="CMU Serif Roman"/>
+          <w:b/>
+          <w:bCs/>
+          <w:color w:val="000000"/>
+          <w:sz w:val="22"/>
+          <w:szCs w:val="22"/>
+        </w:rPr>
+        <w:t xml:space="preserve">file Management </w:t>
       </w:r>
     </w:p>
     <w:p>
@@ -11096,6 +11178,75 @@
         </w:rPr>
         <w:t>The system logs the notification status as either "Sent" or "Read," and the pet owner may review the full notification history at any time.</w:t>
       </w:r>
+    </w:p>
+    <w:p>
+      <w:pPr>
+        <w:spacing w:before="240" w:after="0" w:line="240" w:lineRule="auto"/>
+        <w:jc w:val="thaiDistribute"/>
+        <w:rPr>
+          <w:rFonts w:ascii="CMU Serif Roman" w:eastAsia="Times New Roman" w:hAnsi="CMU Serif Roman" w:cs="CMU Serif Roman"/>
+          <w:b/>
+          <w:bCs/>
+          <w:color w:val="000000"/>
+          <w:kern w:val="0"/>
+          <w:sz w:val="22"/>
+          <w:szCs w:val="22"/>
+          <w14:ligatures w14:val="none"/>
+        </w:rPr>
+      </w:pPr>
+      <w:r>
+        <w:rPr>
+          <w:rFonts w:ascii="CMU Serif Roman" w:eastAsia="Times New Roman" w:hAnsi="CMU Serif Roman" w:cs="CMU Serif Roman"/>
+          <w:b/>
+          <w:bCs/>
+          <w:color w:val="000000"/>
+          <w:kern w:val="0"/>
+          <w:sz w:val="22"/>
+          <w:szCs w:val="22"/>
+          <w14:ligatures w14:val="none"/>
+        </w:rPr>
+        <w:t xml:space="preserve">2.1 </w:t>
+      </w:r>
+      <w:r>
+        <w:rPr>
+          <w:rFonts w:ascii="CMU Serif Roman" w:eastAsia="Times New Roman" w:hAnsi="CMU Serif Roman" w:cs="CMU Serif Roman"/>
+          <w:b/>
+          <w:bCs/>
+          <w:color w:val="000000"/>
+          <w:kern w:val="0"/>
+          <w:sz w:val="22"/>
+          <w:szCs w:val="22"/>
+          <w14:ligatures w14:val="none"/>
+        </w:rPr>
+        <w:t>Functional Requirements</w:t>
+      </w:r>
+    </w:p>
+    <w:p>
+      <w:pPr>
+        <w:spacing w:before="240" w:after="0" w:line="240" w:lineRule="auto"/>
+        <w:jc w:val="thaiDistribute"/>
+        <w:rPr>
+          <w:rFonts w:ascii="CMU Serif Roman" w:hAnsi="CMU Serif Roman" w:cs="CMU Serif Roman"/>
+          <w:color w:val="000000"/>
+          <w:sz w:val="22"/>
+          <w:szCs w:val="22"/>
+          <w:lang w:val="en-US"/>
+        </w:rPr>
+      </w:pPr>
+    </w:p>
+    <w:p>
+      <w:pPr>
+        <w:pStyle w:val="ListParagraph"/>
+        <w:spacing w:before="240" w:after="0" w:line="240" w:lineRule="auto"/>
+        <w:ind w:left="1080"/>
+        <w:jc w:val="thaiDistribute"/>
+        <w:rPr>
+          <w:rFonts w:ascii="CMU Serif Roman" w:hAnsi="CMU Serif Roman" w:cs="CMU Serif Roman"/>
+          <w:color w:val="000000"/>
+          <w:sz w:val="22"/>
+          <w:szCs w:val="22"/>
+        </w:rPr>
+      </w:pPr>
     </w:p>
     <w:p>
       <w:pPr>

</xml_diff>

<commit_message>
doc: add section 4 Assumpitons and anticipated
</commit_message>
<xml_diff>
--- a/documents/Proposal Report.docx
+++ b/documents/Proposal Report.docx
@@ -5644,32 +5644,6 @@
           <w:sz w:val="22"/>
           <w:szCs w:val="22"/>
         </w:rPr>
-        <w:t>hc</w:t>
-      </w:r>
-    </w:p>
-    <w:p>
-      <w:pPr>
-        <w:pStyle w:val="ListParagraph"/>
-        <w:numPr>
-          <w:ilvl w:val="0"/>
-          <w:numId w:val="81"/>
-        </w:numPr>
-        <w:spacing w:before="240" w:after="0" w:line="240" w:lineRule="auto"/>
-        <w:jc w:val="thaiDistribute"/>
-        <w:rPr>
-          <w:rFonts w:ascii="CMU Serif Roman" w:hAnsi="CMU Serif Roman" w:cs="CMU Serif Roman"/>
-          <w:color w:val="000000"/>
-          <w:sz w:val="22"/>
-          <w:szCs w:val="22"/>
-        </w:rPr>
-      </w:pPr>
-      <w:r>
-        <w:rPr>
-          <w:rFonts w:ascii="CMU Serif Roman" w:hAnsi="CMU Serif Roman" w:cs="CMU Serif Roman"/>
-          <w:color w:val="000000"/>
-          <w:sz w:val="22"/>
-          <w:szCs w:val="22"/>
-        </w:rPr>
         <w:t>The owner navigates to the "Add-on Services" menu.</w:t>
       </w:r>
     </w:p>
@@ -11710,6 +11684,812 @@
         </w:rPr>
         <w:t xml:space="preserve"> The system shall immediately notify the assigned receptionist upon the creation of a new booking record within the system.</w:t>
       </w:r>
+    </w:p>
+    <w:p>
+      <w:pPr>
+        <w:spacing w:after="160" w:line="278" w:lineRule="auto"/>
+        <w:rPr>
+          <w:rFonts w:ascii="CMU Serif Roman" w:eastAsiaTheme="minorHAnsi" w:hAnsi="CMU Serif Roman" w:cs="CMU Serif Roman"/>
+          <w:sz w:val="22"/>
+          <w:szCs w:val="22"/>
+        </w:rPr>
+      </w:pPr>
+      <w:r>
+        <w:rPr>
+          <w:rFonts w:ascii="CMU Serif Roman" w:eastAsiaTheme="minorHAnsi" w:hAnsi="CMU Serif Roman" w:cs="CMU Serif Roman"/>
+          <w:sz w:val="22"/>
+          <w:szCs w:val="22"/>
+        </w:rPr>
+        <w:br w:type="page"/>
+      </w:r>
+    </w:p>
+    <w:p>
+      <w:pPr>
+        <w:pBdr>
+          <w:bottom w:val="single" w:sz="4" w:space="1" w:color="auto"/>
+        </w:pBdr>
+        <w:jc w:val="thaiDistribute"/>
+        <w:outlineLvl w:val="2"/>
+        <w:rPr>
+          <w:rFonts w:ascii="CMU Serif Roman" w:hAnsi="CMU Serif Roman" w:cs="CMU Serif Roman"/>
+          <w:b/>
+          <w:bCs/>
+          <w:color w:val="000000"/>
+        </w:rPr>
+      </w:pPr>
+      <w:r>
+        <w:rPr>
+          <w:rFonts w:ascii="CMU Serif Roman" w:hAnsi="CMU Serif Roman" w:cs="CMU Serif Roman"/>
+          <w:b/>
+          <w:bCs/>
+          <w:color w:val="000000"/>
+        </w:rPr>
+        <w:lastRenderedPageBreak/>
+        <w:t>3</w:t>
+      </w:r>
+      <w:r>
+        <w:rPr>
+          <w:rFonts w:ascii="CMU Serif Roman" w:hAnsi="CMU Serif Roman" w:cs="CMU Serif Roman"/>
+          <w:b/>
+          <w:bCs/>
+          <w:color w:val="000000"/>
+        </w:rPr>
+        <w:t>. Draft Database Design</w:t>
+      </w:r>
+    </w:p>
+    <w:p>
+      <w:pPr>
+        <w:jc w:val="thaiDistribute"/>
+        <w:outlineLvl w:val="2"/>
+        <w:rPr>
+          <w:rFonts w:ascii="CMU Serif Roman" w:hAnsi="CMU Serif Roman" w:cs="CMU Serif Roman"/>
+          <w:b/>
+          <w:bCs/>
+          <w:color w:val="000000"/>
+        </w:rPr>
+      </w:pPr>
+    </w:p>
+    <w:p>
+      <w:pPr>
+        <w:jc w:val="thaiDistribute"/>
+        <w:outlineLvl w:val="2"/>
+        <w:rPr>
+          <w:rFonts w:ascii="CMU Serif Roman" w:hAnsi="CMU Serif Roman" w:cs="CMU Serif Roman"/>
+          <w:b/>
+          <w:bCs/>
+          <w:color w:val="000000"/>
+        </w:rPr>
+      </w:pPr>
+    </w:p>
+    <w:p>
+      <w:pPr>
+        <w:jc w:val="thaiDistribute"/>
+        <w:outlineLvl w:val="2"/>
+        <w:rPr>
+          <w:rFonts w:ascii="CMU Serif Roman" w:hAnsi="CMU Serif Roman" w:cs="CMU Serif Roman"/>
+          <w:b/>
+          <w:bCs/>
+          <w:color w:val="000000"/>
+        </w:rPr>
+      </w:pPr>
+    </w:p>
+    <w:p>
+      <w:pPr>
+        <w:jc w:val="thaiDistribute"/>
+        <w:outlineLvl w:val="2"/>
+        <w:rPr>
+          <w:rFonts w:ascii="CMU Serif Roman" w:hAnsi="CMU Serif Roman" w:cs="CMU Serif Roman"/>
+          <w:b/>
+          <w:bCs/>
+          <w:color w:val="000000"/>
+        </w:rPr>
+      </w:pPr>
+    </w:p>
+    <w:p>
+      <w:pPr>
+        <w:jc w:val="thaiDistribute"/>
+        <w:outlineLvl w:val="2"/>
+        <w:rPr>
+          <w:rFonts w:ascii="CMU Serif Roman" w:hAnsi="CMU Serif Roman" w:cs="CMU Serif Roman"/>
+          <w:b/>
+          <w:bCs/>
+          <w:color w:val="000000"/>
+        </w:rPr>
+      </w:pPr>
+      <w:r>
+        <w:rPr>
+          <w:rFonts w:ascii="CMU Serif Roman" w:hAnsi="CMU Serif Roman" w:cs="CMU Serif Roman"/>
+          <w:b/>
+          <w:bCs/>
+          <w:color w:val="000000"/>
+        </w:rPr>
+        <w:t>Asdas</w:t>
+      </w:r>
+    </w:p>
+    <w:p>
+      <w:pPr>
+        <w:jc w:val="thaiDistribute"/>
+        <w:outlineLvl w:val="2"/>
+        <w:rPr>
+          <w:rFonts w:ascii="CMU Serif Roman" w:hAnsi="CMU Serif Roman" w:cs="CMU Serif Roman"/>
+          <w:b/>
+          <w:bCs/>
+          <w:color w:val="000000"/>
+        </w:rPr>
+      </w:pPr>
+      <w:r>
+        <w:rPr>
+          <w:rFonts w:ascii="CMU Serif Roman" w:hAnsi="CMU Serif Roman" w:cs="CMU Serif Roman"/>
+          <w:b/>
+          <w:bCs/>
+          <w:color w:val="000000"/>
+        </w:rPr>
+        <w:t>Asd</w:t>
+      </w:r>
+    </w:p>
+    <w:p>
+      <w:pPr>
+        <w:spacing w:after="160" w:line="278" w:lineRule="auto"/>
+        <w:rPr>
+          <w:rFonts w:ascii="CMU Serif Roman" w:hAnsi="CMU Serif Roman" w:cs="CMU Serif Roman"/>
+          <w:b/>
+          <w:bCs/>
+          <w:color w:val="000000"/>
+        </w:rPr>
+      </w:pPr>
+      <w:r>
+        <w:rPr>
+          <w:rFonts w:ascii="CMU Serif Roman" w:hAnsi="CMU Serif Roman" w:cs="CMU Serif Roman"/>
+          <w:b/>
+          <w:bCs/>
+          <w:color w:val="000000"/>
+        </w:rPr>
+        <w:br w:type="page"/>
+      </w:r>
+    </w:p>
+    <w:p>
+      <w:pPr>
+        <w:pBdr>
+          <w:bottom w:val="single" w:sz="4" w:space="1" w:color="auto"/>
+        </w:pBdr>
+        <w:spacing w:after="240"/>
+        <w:jc w:val="thaiDistribute"/>
+        <w:outlineLvl w:val="2"/>
+        <w:rPr>
+          <w:rFonts w:ascii="CMU Serif Roman" w:hAnsi="CMU Serif Roman" w:cs="CMU Serif Roman"/>
+          <w:b/>
+          <w:bCs/>
+          <w:color w:val="000000"/>
+        </w:rPr>
+      </w:pPr>
+      <w:r>
+        <w:rPr>
+          <w:rFonts w:ascii="CMU Serif Roman" w:hAnsi="CMU Serif Roman" w:cs="CMU Serif Roman"/>
+          <w:b/>
+          <w:bCs/>
+          <w:color w:val="000000"/>
+        </w:rPr>
+        <w:lastRenderedPageBreak/>
+        <w:t>4. Assumptions and Anticipated Challenges</w:t>
+      </w:r>
+    </w:p>
+    <w:p>
+      <w:pPr>
+        <w:spacing w:before="100" w:beforeAutospacing="1" w:after="100" w:afterAutospacing="1"/>
+        <w:jc w:val="thaiDistribute"/>
+        <w:outlineLvl w:val="2"/>
+        <w:rPr>
+          <w:rFonts w:ascii="CMU Serif Roman" w:hAnsi="CMU Serif Roman" w:cs="CMU Serif Roman"/>
+          <w:b/>
+          <w:bCs/>
+          <w:color w:val="000000"/>
+          <w:sz w:val="22"/>
+          <w:szCs w:val="22"/>
+        </w:rPr>
+      </w:pPr>
+      <w:r>
+        <w:rPr>
+          <w:rFonts w:ascii="CMU Serif Roman" w:hAnsi="CMU Serif Roman" w:cs="CMU Serif Roman"/>
+          <w:b/>
+          <w:bCs/>
+          <w:color w:val="000000"/>
+          <w:sz w:val="22"/>
+          <w:szCs w:val="22"/>
+        </w:rPr>
+        <w:t xml:space="preserve">4.1 </w:t>
+      </w:r>
+      <w:r>
+        <w:rPr>
+          <w:rFonts w:ascii="CMU Serif Roman" w:hAnsi="CMU Serif Roman" w:cs="CMU Serif Roman"/>
+          <w:b/>
+          <w:bCs/>
+          <w:color w:val="000000"/>
+          <w:sz w:val="22"/>
+          <w:szCs w:val="22"/>
+        </w:rPr>
+        <w:t>Design Assumptions</w:t>
+      </w:r>
+    </w:p>
+    <w:p>
+      <w:pPr>
+        <w:spacing w:before="100" w:beforeAutospacing="1" w:after="100" w:afterAutospacing="1"/>
+        <w:jc w:val="thaiDistribute"/>
+        <w:rPr>
+          <w:rFonts w:ascii="CMU Serif Roman" w:hAnsi="CMU Serif Roman" w:cs="CMU Serif Roman"/>
+          <w:color w:val="000000"/>
+          <w:sz w:val="22"/>
+          <w:szCs w:val="22"/>
+        </w:rPr>
+      </w:pPr>
+      <w:r>
+        <w:rPr>
+          <w:rFonts w:ascii="CMU Serif Roman" w:hAnsi="CMU Serif Roman" w:cs="CMU Serif Roman"/>
+          <w:color w:val="000000"/>
+          <w:sz w:val="22"/>
+          <w:szCs w:val="22"/>
+        </w:rPr>
+        <w:t>The following assumptions have been established to define the operational boundaries of the system and to guide all subsequent design and development decisions.</w:t>
+      </w:r>
+    </w:p>
+    <w:p>
+      <w:pPr>
+        <w:spacing w:before="100" w:beforeAutospacing="1" w:after="100" w:afterAutospacing="1"/>
+        <w:jc w:val="thaiDistribute"/>
+        <w:rPr>
+          <w:rFonts w:ascii="CMU Serif Roman" w:hAnsi="CMU Serif Roman" w:cs="CMU Serif Roman"/>
+          <w:color w:val="000000"/>
+          <w:sz w:val="22"/>
+          <w:szCs w:val="22"/>
+        </w:rPr>
+      </w:pPr>
+      <w:r>
+        <w:rPr>
+          <w:rFonts w:ascii="CMU Serif Roman" w:hAnsi="CMU Serif Roman" w:cs="CMU Serif Roman"/>
+          <w:b/>
+          <w:bCs/>
+          <w:color w:val="000000"/>
+          <w:sz w:val="22"/>
+          <w:szCs w:val="22"/>
+        </w:rPr>
+        <w:t>4.1.</w:t>
+      </w:r>
+      <w:r>
+        <w:rPr>
+          <w:rFonts w:ascii="CMU Serif Roman" w:hAnsi="CMU Serif Roman" w:cs="CMU Serif Roman"/>
+          <w:b/>
+          <w:bCs/>
+          <w:color w:val="000000"/>
+          <w:sz w:val="22"/>
+          <w:szCs w:val="22"/>
+        </w:rPr>
+        <w:t>1</w:t>
+      </w:r>
+      <w:r>
+        <w:rPr>
+          <w:rFonts w:ascii="CMU Serif Roman" w:hAnsi="CMU Serif Roman" w:cs="CMU Serif Roman"/>
+          <w:color w:val="000000"/>
+          <w:sz w:val="22"/>
+          <w:szCs w:val="22"/>
+        </w:rPr>
+        <w:t xml:space="preserve"> —</w:t>
+      </w:r>
+      <w:r>
+        <w:rPr>
+          <w:rFonts w:ascii="CMU Serif Roman" w:hAnsi="CMU Serif Roman" w:cs="CMU Serif Roman"/>
+          <w:color w:val="000000"/>
+          <w:sz w:val="22"/>
+          <w:szCs w:val="22"/>
+        </w:rPr>
+        <w:t xml:space="preserve"> </w:t>
+      </w:r>
+      <w:r>
+        <w:rPr>
+          <w:rFonts w:ascii="CMU Serif Roman" w:hAnsi="CMU Serif Roman" w:cs="CMU Serif Roman"/>
+          <w:color w:val="000000"/>
+          <w:sz w:val="22"/>
+          <w:szCs w:val="22"/>
+        </w:rPr>
+        <w:t>Single Pet per Booking Record Each booking record is associated with one pet only. In cases where a single owner wishes to board multiple pets simultaneously, the system shall generate separate and independent booking records for each individual pet.</w:t>
+      </w:r>
+    </w:p>
+    <w:p>
+      <w:pPr>
+        <w:spacing w:before="100" w:beforeAutospacing="1" w:after="100" w:afterAutospacing="1"/>
+        <w:jc w:val="thaiDistribute"/>
+        <w:rPr>
+          <w:rFonts w:ascii="CMU Serif Roman" w:hAnsi="CMU Serif Roman" w:cs="CMU Serif Roman"/>
+          <w:color w:val="000000"/>
+          <w:sz w:val="22"/>
+          <w:szCs w:val="22"/>
+        </w:rPr>
+      </w:pPr>
+      <w:r>
+        <w:rPr>
+          <w:rFonts w:ascii="CMU Serif Roman" w:hAnsi="CMU Serif Roman" w:cs="CMU Serif Roman"/>
+          <w:b/>
+          <w:bCs/>
+          <w:color w:val="000000"/>
+          <w:sz w:val="22"/>
+          <w:szCs w:val="22"/>
+        </w:rPr>
+        <w:t>4.1.</w:t>
+      </w:r>
+      <w:r>
+        <w:rPr>
+          <w:rFonts w:ascii="CMU Serif Roman" w:hAnsi="CMU Serif Roman" w:cs="CMU Serif Roman"/>
+          <w:b/>
+          <w:bCs/>
+          <w:color w:val="000000"/>
+          <w:sz w:val="22"/>
+          <w:szCs w:val="22"/>
+        </w:rPr>
+        <w:t>2</w:t>
+      </w:r>
+      <w:r>
+        <w:rPr>
+          <w:rFonts w:ascii="CMU Serif Roman" w:hAnsi="CMU Serif Roman" w:cs="CMU Serif Roman"/>
+          <w:color w:val="000000"/>
+          <w:sz w:val="22"/>
+          <w:szCs w:val="22"/>
+        </w:rPr>
+        <w:t xml:space="preserve"> — Daily-Level Room Availability Management Room availability is managed at the granularity of a full calendar day. The system does not support hourly or time-slot-based booking. Check-in and check-out are processed on a per-day basis.</w:t>
+      </w:r>
+    </w:p>
+    <w:p>
+      <w:pPr>
+        <w:spacing w:before="100" w:beforeAutospacing="1" w:after="100" w:afterAutospacing="1"/>
+        <w:jc w:val="thaiDistribute"/>
+        <w:rPr>
+          <w:rFonts w:ascii="CMU Serif Roman" w:hAnsi="CMU Serif Roman" w:cs="CMU Serif Roman"/>
+          <w:color w:val="000000"/>
+          <w:sz w:val="22"/>
+          <w:szCs w:val="22"/>
+        </w:rPr>
+      </w:pPr>
+      <w:r>
+        <w:rPr>
+          <w:rFonts w:ascii="CMU Serif Roman" w:hAnsi="CMU Serif Roman" w:cs="CMU Serif Roman"/>
+          <w:b/>
+          <w:bCs/>
+          <w:color w:val="000000"/>
+          <w:sz w:val="22"/>
+          <w:szCs w:val="22"/>
+        </w:rPr>
+        <w:t>4.1.</w:t>
+      </w:r>
+      <w:r>
+        <w:rPr>
+          <w:rFonts w:ascii="CMU Serif Roman" w:hAnsi="CMU Serif Roman" w:cs="CMU Serif Roman"/>
+          <w:b/>
+          <w:bCs/>
+          <w:color w:val="000000"/>
+          <w:sz w:val="22"/>
+          <w:szCs w:val="22"/>
+        </w:rPr>
+        <w:t xml:space="preserve">3 </w:t>
+      </w:r>
+      <w:r>
+        <w:rPr>
+          <w:rFonts w:ascii="CMU Serif Roman" w:hAnsi="CMU Serif Roman" w:cs="CMU Serif Roman"/>
+          <w:color w:val="000000"/>
+          <w:sz w:val="22"/>
+          <w:szCs w:val="22"/>
+        </w:rPr>
+        <w:t>— Internal Staff Access Only In the initial release phase, system access is restricted exclusively to internal staff, including receptionists, pet caretakers, general staff, managers, and the business owner. Customer-facing login and self-service functionalities are not included within the current project scope and are designated for a future development phase.</w:t>
+      </w:r>
+    </w:p>
+    <w:p>
+      <w:pPr>
+        <w:spacing w:before="100" w:beforeAutospacing="1" w:after="100" w:afterAutospacing="1"/>
+        <w:jc w:val="thaiDistribute"/>
+        <w:rPr>
+          <w:rFonts w:ascii="CMU Serif Roman" w:hAnsi="CMU Serif Roman" w:cs="CMU Serif Roman"/>
+          <w:color w:val="000000"/>
+          <w:sz w:val="22"/>
+          <w:szCs w:val="22"/>
+        </w:rPr>
+      </w:pPr>
+      <w:r>
+        <w:rPr>
+          <w:rFonts w:ascii="CMU Serif Roman" w:hAnsi="CMU Serif Roman" w:cs="CMU Serif Roman"/>
+          <w:b/>
+          <w:bCs/>
+          <w:color w:val="000000"/>
+          <w:sz w:val="22"/>
+          <w:szCs w:val="22"/>
+        </w:rPr>
+        <w:t>4.1.</w:t>
+      </w:r>
+      <w:r>
+        <w:rPr>
+          <w:rFonts w:ascii="CMU Serif Roman" w:hAnsi="CMU Serif Roman" w:cs="CMU Serif Roman"/>
+          <w:b/>
+          <w:bCs/>
+          <w:color w:val="000000"/>
+          <w:sz w:val="22"/>
+          <w:szCs w:val="22"/>
+        </w:rPr>
+        <w:t xml:space="preserve">4 </w:t>
+      </w:r>
+      <w:r>
+        <w:rPr>
+          <w:rFonts w:ascii="CMU Serif Roman" w:hAnsi="CMU Serif Roman" w:cs="CMU Serif Roman"/>
+          <w:color w:val="000000"/>
+          <w:sz w:val="22"/>
+          <w:szCs w:val="22"/>
+        </w:rPr>
+        <w:t>— Free-Text Medical and Vaccination Records Vaccination histories and medical information are stored as free-text notes entered manually by staff. The system does not implement a structured medical record schema in this phase. Attachment of veterinary certification documents in PDF format is supported as supplementary evidence.</w:t>
+      </w:r>
+    </w:p>
+    <w:p>
+      <w:pPr>
+        <w:spacing w:before="100" w:beforeAutospacing="1" w:after="100" w:afterAutospacing="1"/>
+        <w:jc w:val="thaiDistribute"/>
+        <w:rPr>
+          <w:rFonts w:ascii="CMU Serif Roman" w:hAnsi="CMU Serif Roman" w:cs="CMU Serif Roman"/>
+          <w:color w:val="000000"/>
+          <w:sz w:val="22"/>
+          <w:szCs w:val="22"/>
+        </w:rPr>
+      </w:pPr>
+      <w:r>
+        <w:rPr>
+          <w:rFonts w:ascii="CMU Serif Roman" w:hAnsi="CMU Serif Roman" w:cs="CMU Serif Roman"/>
+          <w:b/>
+          <w:bCs/>
+          <w:color w:val="000000"/>
+          <w:sz w:val="22"/>
+          <w:szCs w:val="22"/>
+        </w:rPr>
+        <w:t>4.1.</w:t>
+      </w:r>
+      <w:r>
+        <w:rPr>
+          <w:rFonts w:ascii="CMU Serif Roman" w:hAnsi="CMU Serif Roman" w:cs="CMU Serif Roman"/>
+          <w:b/>
+          <w:bCs/>
+          <w:color w:val="000000"/>
+          <w:sz w:val="22"/>
+          <w:szCs w:val="22"/>
+        </w:rPr>
+        <w:t>5</w:t>
+      </w:r>
+      <w:r>
+        <w:rPr>
+          <w:rFonts w:ascii="CMU Serif Roman" w:hAnsi="CMU Serif Roman" w:cs="CMU Serif Roman"/>
+          <w:color w:val="000000"/>
+          <w:sz w:val="22"/>
+          <w:szCs w:val="22"/>
+        </w:rPr>
+        <w:t xml:space="preserve"> — External Payment Processing The system does not integrate with any payment gateway or financial processing service. All monetary transactions are handled through external means (e.g., cash, QR PromptPay, credit card terminal). The system records only the payment status (Paid / Unpaid) and the payment method for billing and reporting purposes.</w:t>
+      </w:r>
+    </w:p>
+    <w:p>
+      <w:pPr>
+        <w:spacing w:before="100" w:beforeAutospacing="1" w:after="100" w:afterAutospacing="1"/>
+        <w:jc w:val="thaiDistribute"/>
+        <w:rPr>
+          <w:rFonts w:ascii="CMU Serif Roman" w:hAnsi="CMU Serif Roman" w:cs="CMU Serif Roman"/>
+          <w:color w:val="000000"/>
+          <w:sz w:val="22"/>
+          <w:szCs w:val="22"/>
+        </w:rPr>
+      </w:pPr>
+      <w:r>
+        <w:rPr>
+          <w:rFonts w:ascii="CMU Serif Roman" w:hAnsi="CMU Serif Roman" w:cs="CMU Serif Roman"/>
+          <w:b/>
+          <w:bCs/>
+          <w:color w:val="000000"/>
+          <w:sz w:val="22"/>
+          <w:szCs w:val="22"/>
+        </w:rPr>
+        <w:t>4.1.</w:t>
+      </w:r>
+      <w:r>
+        <w:rPr>
+          <w:rFonts w:ascii="CMU Serif Roman" w:hAnsi="CMU Serif Roman" w:cs="CMU Serif Roman"/>
+          <w:b/>
+          <w:bCs/>
+          <w:color w:val="000000"/>
+          <w:sz w:val="22"/>
+          <w:szCs w:val="22"/>
+        </w:rPr>
+        <w:t xml:space="preserve">6 </w:t>
+      </w:r>
+      <w:r>
+        <w:rPr>
+          <w:rFonts w:ascii="CMU Serif Roman" w:hAnsi="CMU Serif Roman" w:cs="CMU Serif Roman"/>
+          <w:color w:val="000000"/>
+          <w:sz w:val="22"/>
+          <w:szCs w:val="22"/>
+        </w:rPr>
+        <w:t>— Fixed Room Rate at Time of Booking The total room charge is calculated and locked at the time of booking confirmation based on the room's base rate at that moment. Subsequent modifications to the room's base rate shall not retroactively affect any previously confirmed booking records.</w:t>
+      </w:r>
+    </w:p>
+    <w:p>
+      <w:pPr>
+        <w:spacing w:before="100" w:beforeAutospacing="1" w:after="100" w:afterAutospacing="1"/>
+        <w:jc w:val="thaiDistribute"/>
+        <w:rPr>
+          <w:rFonts w:ascii="CMU Serif Roman" w:hAnsi="CMU Serif Roman" w:cs="CMU Serif Roman"/>
+          <w:b/>
+          <w:bCs/>
+          <w:color w:val="000000"/>
+          <w:sz w:val="22"/>
+          <w:szCs w:val="22"/>
+        </w:rPr>
+      </w:pPr>
+      <w:r>
+        <w:rPr>
+          <w:rFonts w:ascii="CMU Serif Roman" w:hAnsi="CMU Serif Roman" w:cs="CMU Serif Roman"/>
+          <w:b/>
+          <w:bCs/>
+          <w:color w:val="000000"/>
+          <w:sz w:val="22"/>
+          <w:szCs w:val="22"/>
+        </w:rPr>
+        <w:t>4.2 Expected Challenges and Limitations</w:t>
+      </w:r>
+    </w:p>
+    <w:p>
+      <w:pPr>
+        <w:spacing w:before="100" w:beforeAutospacing="1" w:after="100" w:afterAutospacing="1"/>
+        <w:jc w:val="thaiDistribute"/>
+        <w:rPr>
+          <w:rFonts w:ascii="CMU Serif Roman" w:hAnsi="CMU Serif Roman" w:cs="CMU Serif Roman"/>
+          <w:color w:val="000000"/>
+          <w:sz w:val="22"/>
+          <w:szCs w:val="22"/>
+        </w:rPr>
+      </w:pPr>
+      <w:r>
+        <w:rPr>
+          <w:rFonts w:ascii="CMU Serif Roman" w:hAnsi="CMU Serif Roman" w:cs="CMU Serif Roman"/>
+          <w:b/>
+          <w:bCs/>
+          <w:color w:val="000000"/>
+          <w:sz w:val="22"/>
+          <w:szCs w:val="22"/>
+        </w:rPr>
+        <w:t>4.2.</w:t>
+      </w:r>
+      <w:r>
+        <w:rPr>
+          <w:rFonts w:ascii="CMU Serif Roman" w:hAnsi="CMU Serif Roman" w:cs="CMU Serif Roman"/>
+          <w:b/>
+          <w:bCs/>
+          <w:color w:val="000000"/>
+          <w:sz w:val="22"/>
+          <w:szCs w:val="22"/>
+        </w:rPr>
+        <w:t xml:space="preserve">1 </w:t>
+      </w:r>
+      <w:r>
+        <w:rPr>
+          <w:rFonts w:ascii="CMU Serif Roman" w:hAnsi="CMU Serif Roman" w:cs="CMU Serif Roman"/>
+          <w:color w:val="000000"/>
+          <w:sz w:val="22"/>
+          <w:szCs w:val="22"/>
+        </w:rPr>
+        <w:t>— Concurrent Booking Conflicts and Race Conditions When two or more staff members attempt to reserve the same room for an overlapping date range simultaneously, the system is susceptible to double-booking errors. This challenge requires the implementation of transaction-level locking mechanisms within the PostgreSQL database — specifically, the use of SELECT FOR UPDATE or serializable transaction isolation — to ensure that room availability checks and reservation insertions are executed as atomic operations.</w:t>
+      </w:r>
+    </w:p>
+    <w:p>
+      <w:pPr>
+        <w:spacing w:before="100" w:beforeAutospacing="1" w:after="100" w:afterAutospacing="1"/>
+        <w:jc w:val="thaiDistribute"/>
+        <w:rPr>
+          <w:rFonts w:ascii="CMU Serif Roman" w:hAnsi="CMU Serif Roman" w:cs="CMU Serif Roman"/>
+          <w:color w:val="000000"/>
+          <w:sz w:val="22"/>
+          <w:szCs w:val="22"/>
+        </w:rPr>
+      </w:pPr>
+      <w:r>
+        <w:rPr>
+          <w:rFonts w:ascii="CMU Serif Roman" w:hAnsi="CMU Serif Roman" w:cs="CMU Serif Roman"/>
+          <w:b/>
+          <w:bCs/>
+          <w:color w:val="000000"/>
+          <w:sz w:val="22"/>
+          <w:szCs w:val="22"/>
+        </w:rPr>
+        <w:lastRenderedPageBreak/>
+        <w:t>4.2.</w:t>
+      </w:r>
+      <w:r>
+        <w:rPr>
+          <w:rFonts w:ascii="CMU Serif Roman" w:hAnsi="CMU Serif Roman" w:cs="CMU Serif Roman"/>
+          <w:b/>
+          <w:bCs/>
+          <w:color w:val="000000"/>
+          <w:sz w:val="22"/>
+          <w:szCs w:val="22"/>
+        </w:rPr>
+        <w:t xml:space="preserve">2 </w:t>
+      </w:r>
+      <w:r>
+        <w:rPr>
+          <w:rFonts w:ascii="CMU Serif Roman" w:hAnsi="CMU Serif Roman" w:cs="CMU Serif Roman"/>
+          <w:color w:val="000000"/>
+          <w:sz w:val="22"/>
+          <w:szCs w:val="22"/>
+        </w:rPr>
+        <w:t>— Data Completeness and Input Quality Pet medical histories, vaccination records, feeding preferences, and behavioral notes are entered manually by staff. Inconsistent or incomplete data entry represents a persistent risk to data quality. While the system enforces required fields and basic validation rules, these measures cannot fully guarantee the accuracy or completeness of free-text inputs. Staff training and standardized data entry protocols will be essential to mitigating this limitation.</w:t>
+      </w:r>
+    </w:p>
+    <w:p>
+      <w:pPr>
+        <w:spacing w:before="100" w:beforeAutospacing="1" w:after="100" w:afterAutospacing="1"/>
+        <w:jc w:val="thaiDistribute"/>
+        <w:rPr>
+          <w:rFonts w:ascii="CMU Serif Roman" w:hAnsi="CMU Serif Roman" w:cs="CMU Serif Roman"/>
+          <w:color w:val="000000"/>
+          <w:sz w:val="22"/>
+          <w:szCs w:val="22"/>
+        </w:rPr>
+      </w:pPr>
+      <w:r>
+        <w:rPr>
+          <w:rFonts w:ascii="CMU Serif Roman" w:hAnsi="CMU Serif Roman" w:cs="CMU Serif Roman"/>
+          <w:b/>
+          <w:bCs/>
+          <w:color w:val="000000"/>
+          <w:sz w:val="22"/>
+          <w:szCs w:val="22"/>
+        </w:rPr>
+        <w:t>4.2.</w:t>
+      </w:r>
+      <w:r>
+        <w:rPr>
+          <w:rFonts w:ascii="CMU Serif Roman" w:hAnsi="CMU Serif Roman" w:cs="CMU Serif Roman"/>
+          <w:b/>
+          <w:bCs/>
+          <w:color w:val="000000"/>
+          <w:sz w:val="22"/>
+          <w:szCs w:val="22"/>
+        </w:rPr>
+        <w:t xml:space="preserve">3 </w:t>
+      </w:r>
+      <w:r>
+        <w:rPr>
+          <w:rFonts w:ascii="CMU Serif Roman" w:hAnsi="CMU Serif Roman" w:cs="CMU Serif Roman"/>
+          <w:color w:val="000000"/>
+          <w:sz w:val="22"/>
+          <w:szCs w:val="22"/>
+        </w:rPr>
+        <w:t>— Scope Creep and Feature Boundary Management Several features were discussed informally during the requirements gathering phase, including customer-facing online booking, automated SMS and email reminder notifications, LINE integration, and a customer loyalty rewards program. These features carry significant implementation complexity and are explicitly excluded from the current release scope. Without clearly defined boundaries, incremental feature additions risk destabilizing the project timeline and compromising the quality of core deliverables.</w:t>
+      </w:r>
+    </w:p>
+    <w:p>
+      <w:pPr>
+        <w:spacing w:before="100" w:beforeAutospacing="1" w:after="100" w:afterAutospacing="1"/>
+        <w:jc w:val="thaiDistribute"/>
+        <w:rPr>
+          <w:rFonts w:ascii="CMU Serif Roman" w:hAnsi="CMU Serif Roman" w:cs="CMU Serif Roman"/>
+          <w:color w:val="000000"/>
+          <w:sz w:val="22"/>
+          <w:szCs w:val="22"/>
+        </w:rPr>
+      </w:pPr>
+      <w:r>
+        <w:rPr>
+          <w:rFonts w:ascii="CMU Serif Roman" w:hAnsi="CMU Serif Roman" w:cs="CMU Serif Roman"/>
+          <w:b/>
+          <w:bCs/>
+          <w:color w:val="000000"/>
+          <w:sz w:val="22"/>
+          <w:szCs w:val="22"/>
+        </w:rPr>
+        <w:t>4.2.4</w:t>
+      </w:r>
+      <w:r>
+        <w:rPr>
+          <w:rFonts w:ascii="CMU Serif Roman" w:hAnsi="CMU Serif Roman" w:cs="CMU Serif Roman"/>
+          <w:b/>
+          <w:bCs/>
+          <w:color w:val="000000"/>
+          <w:sz w:val="22"/>
+          <w:szCs w:val="22"/>
+        </w:rPr>
+        <w:t xml:space="preserve"> </w:t>
+      </w:r>
+      <w:r>
+        <w:rPr>
+          <w:rFonts w:ascii="CMU Serif Roman" w:hAnsi="CMU Serif Roman" w:cs="CMU Serif Roman"/>
+          <w:color w:val="000000"/>
+          <w:sz w:val="22"/>
+          <w:szCs w:val="22"/>
+        </w:rPr>
+        <w:t>— Notification Delivery Reliability The system relies on external notification channels — particularly LINE — for dispatching daily care report updates, booking confirmations, and reminder alerts to pet owners. Delivery reliability is subject to third-party service availability and network conditions, which fall outside the system's direct control. Failures in notification delivery may affect customer satisfaction and trust in system responsiveness.</w:t>
+      </w:r>
+    </w:p>
+    <w:p>
+      <w:pPr>
+        <w:spacing w:after="160" w:line="278" w:lineRule="auto"/>
+        <w:rPr>
+          <w:rFonts w:ascii="CMU Serif Roman" w:hAnsi="CMU Serif Roman" w:cs="CMU Serif Roman"/>
+          <w:color w:val="000000"/>
+          <w:sz w:val="22"/>
+          <w:szCs w:val="22"/>
+        </w:rPr>
+      </w:pPr>
+      <w:r>
+        <w:rPr>
+          <w:rFonts w:ascii="CMU Serif Roman" w:hAnsi="CMU Serif Roman" w:cs="CMU Serif Roman"/>
+          <w:color w:val="000000"/>
+          <w:sz w:val="22"/>
+          <w:szCs w:val="22"/>
+        </w:rPr>
+        <w:br w:type="page"/>
+      </w:r>
+    </w:p>
+    <w:p>
+      <w:pPr>
+        <w:spacing w:before="100" w:beforeAutospacing="1" w:after="100" w:afterAutospacing="1"/>
+        <w:jc w:val="thaiDistribute"/>
+        <w:rPr>
+          <w:rFonts w:ascii="CMU Serif Roman" w:hAnsi="CMU Serif Roman" w:cs="CMU Serif Roman"/>
+          <w:b/>
+          <w:bCs/>
+          <w:color w:val="000000"/>
+          <w:sz w:val="22"/>
+          <w:szCs w:val="22"/>
+        </w:rPr>
+      </w:pPr>
+    </w:p>
+    <w:p>
+      <w:pPr>
+        <w:spacing w:before="100" w:beforeAutospacing="1" w:after="100" w:afterAutospacing="1"/>
+        <w:jc w:val="thaiDistribute"/>
+        <w:rPr>
+          <w:rFonts w:ascii="CMU Serif Roman" w:hAnsi="CMU Serif Roman" w:cs="CMU Serif Roman"/>
+          <w:b/>
+          <w:bCs/>
+          <w:color w:val="000000"/>
+          <w:sz w:val="22"/>
+          <w:szCs w:val="22"/>
+        </w:rPr>
+      </w:pPr>
+    </w:p>
+    <w:p>
+      <w:pPr>
+        <w:spacing w:before="100" w:beforeAutospacing="1" w:after="100" w:afterAutospacing="1"/>
+        <w:jc w:val="thaiDistribute"/>
+        <w:rPr>
+          <w:rFonts w:ascii="CMU Serif Roman" w:hAnsi="CMU Serif Roman" w:cs="CMU Serif Roman"/>
+          <w:b/>
+          <w:bCs/>
+          <w:color w:val="000000"/>
+          <w:sz w:val="22"/>
+          <w:szCs w:val="22"/>
+        </w:rPr>
+      </w:pPr>
+    </w:p>
+    <w:p>
+      <w:pPr>
+        <w:jc w:val="thaiDistribute"/>
+        <w:outlineLvl w:val="2"/>
+        <w:rPr>
+          <w:rFonts w:ascii="CMU Serif Roman" w:hAnsi="CMU Serif Roman" w:cs="CMU Serif Roman"/>
+          <w:b/>
+          <w:bCs/>
+          <w:color w:val="000000"/>
+        </w:rPr>
+      </w:pPr>
+    </w:p>
+    <w:p>
+      <w:pPr>
+        <w:jc w:val="thaiDistribute"/>
+        <w:outlineLvl w:val="2"/>
+        <w:rPr>
+          <w:rFonts w:ascii="CMU Serif Roman" w:hAnsi="CMU Serif Roman" w:cs="CMU Serif Roman"/>
+          <w:b/>
+          <w:bCs/>
+          <w:color w:val="000000"/>
+        </w:rPr>
+      </w:pPr>
     </w:p>
     <w:sectPr>
       <w:headerReference w:type="default" r:id="rId8"/>
@@ -26089,7 +26869,6 @@
   <w:style w:type="character" w:default="1" w:styleId="DefaultParagraphFont">
     <w:name w:val="Default Paragraph Font"/>
     <w:uiPriority w:val="1"/>
-    <w:semiHidden/>
     <w:unhideWhenUsed/>
   </w:style>
   <w:style w:type="table" w:default="1" w:styleId="TableNormal">

</xml_diff>